<commit_message>
Add stock multivariate model comparison examples
</commit_message>
<xml_diff>
--- a/examples/multivariate/doc/10-stock-close-regression.docx
+++ b/examples/multivariate/doc/10-stock-close-regression.docx
@@ -308,592 +308,16 @@
     </w:p>
     <w:p>
       <w:pPr>
-        <w:pStyle w:val="SourceCode"/>
-      </w:pPr>
-      <w:r>
-        <w:rPr>
-          <w:rStyle w:val="FunctionTok"/>
-        </w:rPr>
-        <w:t xml:space="preserve">data</w:t>
-      </w:r>
-      <w:r>
-        <w:rPr>
-          <w:rStyle w:val="NormalTok"/>
-        </w:rPr>
-        <w:t xml:space="preserve">(stocks)</w:t>
-      </w:r>
-      <w:r>
-        <w:br/>
-      </w:r>
-      <w:r>
-        <w:br/>
-      </w:r>
-      <w:r>
-        <w:rPr>
-          <w:rStyle w:val="ControlFlowTok"/>
-        </w:rPr>
-        <w:t xml:space="preserve">if</w:t>
-      </w:r>
-      <w:r>
-        <w:rPr>
-          <w:rStyle w:val="NormalTok"/>
-        </w:rPr>
-        <w:t xml:space="preserve"> (</w:t>
-      </w:r>
-      <w:r>
-        <w:rPr>
-          <w:rStyle w:val="SpecialCharTok"/>
-        </w:rPr>
-        <w:t xml:space="preserve">!</w:t>
-      </w:r>
-      <w:r>
-        <w:rPr>
-          <w:rStyle w:val="FunctionTok"/>
-        </w:rPr>
-        <w:t xml:space="preserve">is.null</w:t>
-      </w:r>
-      <w:r>
-        <w:rPr>
-          <w:rStyle w:val="NormalTok"/>
-        </w:rPr>
-        <w:t xml:space="preserve">(</w:t>
-      </w:r>
-      <w:r>
-        <w:rPr>
-          <w:rStyle w:val="FunctionTok"/>
-        </w:rPr>
-        <w:t xml:space="preserve">attr</w:t>
-      </w:r>
-      <w:r>
-        <w:rPr>
-          <w:rStyle w:val="NormalTok"/>
-        </w:rPr>
-        <w:t xml:space="preserve">(stocks, </w:t>
-      </w:r>
-      <w:r>
-        <w:rPr>
-          <w:rStyle w:val="StringTok"/>
-        </w:rPr>
-        <w:t xml:space="preserve">"url"</w:t>
-      </w:r>
-      <w:r>
-        <w:rPr>
-          <w:rStyle w:val="NormalTok"/>
-        </w:rPr>
-        <w:t xml:space="preserve">))) {</w:t>
-      </w:r>
-      <w:r>
-        <w:br/>
-      </w:r>
-      <w:r>
-        <w:rPr>
-          <w:rStyle w:val="NormalTok"/>
-        </w:rPr>
-        <w:t xml:space="preserve">  stocks </w:t>
-      </w:r>
-      <w:r>
-        <w:rPr>
-          <w:rStyle w:val="OtherTok"/>
-        </w:rPr>
-        <w:t xml:space="preserve">&lt;-</w:t>
-      </w:r>
-      <w:r>
-        <w:rPr>
-          <w:rStyle w:val="NormalTok"/>
-        </w:rPr>
-        <w:t xml:space="preserve"> </w:t>
-      </w:r>
-      <w:r>
-        <w:rPr>
-          <w:rStyle w:val="FunctionTok"/>
-        </w:rPr>
-        <w:t xml:space="preserve">loadfulldata</w:t>
-      </w:r>
-      <w:r>
-        <w:rPr>
-          <w:rStyle w:val="NormalTok"/>
-        </w:rPr>
-        <w:t xml:space="preserve">(stocks)</w:t>
-      </w:r>
-      <w:r>
-        <w:br/>
-      </w:r>
-      <w:r>
-        <w:rPr>
-          <w:rStyle w:val="NormalTok"/>
-        </w:rPr>
-        <w:t xml:space="preserve">}</w:t>
-      </w:r>
-      <w:r>
-        <w:br/>
-      </w:r>
-      <w:r>
-        <w:br/>
-      </w:r>
-      <w:r>
-        <w:rPr>
-          <w:rStyle w:val="NormalTok"/>
-        </w:rPr>
-        <w:t xml:space="preserve">ticker_name </w:t>
-      </w:r>
-      <w:r>
-        <w:rPr>
-          <w:rStyle w:val="OtherTok"/>
-        </w:rPr>
-        <w:t xml:space="preserve">&lt;-</w:t>
-      </w:r>
-      <w:r>
-        <w:rPr>
-          <w:rStyle w:val="NormalTok"/>
-        </w:rPr>
-        <w:t xml:space="preserve"> </w:t>
-      </w:r>
-      <w:r>
-        <w:rPr>
-          <w:rStyle w:val="ControlFlowTok"/>
-        </w:rPr>
-        <w:t xml:space="preserve">if</w:t>
-      </w:r>
-      <w:r>
-        <w:rPr>
-          <w:rStyle w:val="NormalTok"/>
-        </w:rPr>
-        <w:t xml:space="preserve"> (</w:t>
-      </w:r>
-      <w:r>
-        <w:rPr>
-          <w:rStyle w:val="StringTok"/>
-        </w:rPr>
-        <w:t xml:space="preserve">"VALE3"</w:t>
-      </w:r>
-      <w:r>
-        <w:rPr>
-          <w:rStyle w:val="NormalTok"/>
-        </w:rPr>
-        <w:t xml:space="preserve"> </w:t>
-      </w:r>
-      <w:r>
-        <w:rPr>
-          <w:rStyle w:val="SpecialCharTok"/>
-        </w:rPr>
-        <w:t xml:space="preserve">%in%</w:t>
-      </w:r>
-      <w:r>
-        <w:rPr>
-          <w:rStyle w:val="NormalTok"/>
-        </w:rPr>
-        <w:t xml:space="preserve"> </w:t>
-      </w:r>
-      <w:r>
-        <w:rPr>
-          <w:rStyle w:val="FunctionTok"/>
-        </w:rPr>
-        <w:t xml:space="preserve">names</w:t>
-      </w:r>
-      <w:r>
-        <w:rPr>
-          <w:rStyle w:val="NormalTok"/>
-        </w:rPr>
-        <w:t xml:space="preserve">(stocks)) </w:t>
-      </w:r>
-      <w:r>
-        <w:rPr>
-          <w:rStyle w:val="StringTok"/>
-        </w:rPr>
-        <w:t xml:space="preserve">"VALE3"</w:t>
-      </w:r>
-      <w:r>
-        <w:rPr>
-          <w:rStyle w:val="NormalTok"/>
-        </w:rPr>
-        <w:t xml:space="preserve"> </w:t>
-      </w:r>
-      <w:r>
-        <w:rPr>
-          <w:rStyle w:val="ControlFlowTok"/>
-        </w:rPr>
-        <w:t xml:space="preserve">else</w:t>
-      </w:r>
-      <w:r>
-        <w:rPr>
-          <w:rStyle w:val="NormalTok"/>
-        </w:rPr>
-        <w:t xml:space="preserve"> </w:t>
-      </w:r>
-      <w:r>
-        <w:rPr>
-          <w:rStyle w:val="FunctionTok"/>
-        </w:rPr>
-        <w:t xml:space="preserve">names</w:t>
-      </w:r>
-      <w:r>
-        <w:rPr>
-          <w:rStyle w:val="NormalTok"/>
-        </w:rPr>
-        <w:t xml:space="preserve">(stocks)[</w:t>
-      </w:r>
-      <w:r>
-        <w:rPr>
-          <w:rStyle w:val="DecValTok"/>
-        </w:rPr>
-        <w:t xml:space="preserve">1</w:t>
-      </w:r>
-      <w:r>
-        <w:rPr>
-          <w:rStyle w:val="NormalTok"/>
-        </w:rPr>
-        <w:t xml:space="preserve">]</w:t>
-      </w:r>
-      <w:r>
-        <w:br/>
-      </w:r>
-      <w:r>
-        <w:rPr>
-          <w:rStyle w:val="NormalTok"/>
-        </w:rPr>
-        <w:t xml:space="preserve">ticker </w:t>
-      </w:r>
-      <w:r>
-        <w:rPr>
-          <w:rStyle w:val="OtherTok"/>
-        </w:rPr>
-        <w:t xml:space="preserve">&lt;-</w:t>
-      </w:r>
-      <w:r>
-        <w:rPr>
-          <w:rStyle w:val="NormalTok"/>
-        </w:rPr>
-        <w:t xml:space="preserve"> stocks[[ticker_name]]</w:t>
-      </w:r>
-      <w:r>
-        <w:br/>
-      </w:r>
-      <w:r>
-        <w:rPr>
-          <w:rStyle w:val="NormalTok"/>
-        </w:rPr>
-        <w:t xml:space="preserve">ticker </w:t>
-      </w:r>
-      <w:r>
-        <w:rPr>
-          <w:rStyle w:val="OtherTok"/>
-        </w:rPr>
-        <w:t xml:space="preserve">&lt;-</w:t>
-      </w:r>
-      <w:r>
-        <w:rPr>
-          <w:rStyle w:val="NormalTok"/>
-        </w:rPr>
-        <w:t xml:space="preserve"> ticker[, </w:t>
-      </w:r>
-      <w:r>
-        <w:rPr>
-          <w:rStyle w:val="FunctionTok"/>
-        </w:rPr>
-        <w:t xml:space="preserve">c</w:t>
-      </w:r>
-      <w:r>
-        <w:rPr>
-          <w:rStyle w:val="NormalTok"/>
-        </w:rPr>
-        <w:t xml:space="preserve">(</w:t>
-      </w:r>
-      <w:r>
-        <w:rPr>
-          <w:rStyle w:val="StringTok"/>
-        </w:rPr>
-        <w:t xml:space="preserve">"open"</w:t>
-      </w:r>
-      <w:r>
-        <w:rPr>
-          <w:rStyle w:val="NormalTok"/>
-        </w:rPr>
-        <w:t xml:space="preserve">, </w:t>
-      </w:r>
-      <w:r>
-        <w:rPr>
-          <w:rStyle w:val="StringTok"/>
-        </w:rPr>
-        <w:t xml:space="preserve">"high"</w:t>
-      </w:r>
-      <w:r>
-        <w:rPr>
-          <w:rStyle w:val="NormalTok"/>
-        </w:rPr>
-        <w:t xml:space="preserve">, </w:t>
-      </w:r>
-      <w:r>
-        <w:rPr>
-          <w:rStyle w:val="StringTok"/>
-        </w:rPr>
-        <w:t xml:space="preserve">"low"</w:t>
-      </w:r>
-      <w:r>
-        <w:rPr>
-          <w:rStyle w:val="NormalTok"/>
-        </w:rPr>
-        <w:t xml:space="preserve">, </w:t>
-      </w:r>
-      <w:r>
-        <w:rPr>
-          <w:rStyle w:val="StringTok"/>
-        </w:rPr>
-        <w:t xml:space="preserve">"close"</w:t>
-      </w:r>
-      <w:r>
-        <w:rPr>
-          <w:rStyle w:val="NormalTok"/>
-        </w:rPr>
-        <w:t xml:space="preserve">, </w:t>
-      </w:r>
-      <w:r>
-        <w:rPr>
-          <w:rStyle w:val="StringTok"/>
-        </w:rPr>
-        <w:t xml:space="preserve">"volume"</w:t>
-      </w:r>
-      <w:r>
-        <w:rPr>
-          <w:rStyle w:val="NormalTok"/>
-        </w:rPr>
-        <w:t xml:space="preserve">)]</w:t>
-      </w:r>
-      <w:r>
-        <w:br/>
-      </w:r>
-      <w:r>
-        <w:rPr>
-          <w:rStyle w:val="NormalTok"/>
-        </w:rPr>
-        <w:t xml:space="preserve">ticker </w:t>
-      </w:r>
-      <w:r>
-        <w:rPr>
-          <w:rStyle w:val="OtherTok"/>
-        </w:rPr>
-        <w:t xml:space="preserve">&lt;-</w:t>
-      </w:r>
-      <w:r>
-        <w:rPr>
-          <w:rStyle w:val="NormalTok"/>
-        </w:rPr>
-        <w:t xml:space="preserve"> stats</w:t>
-      </w:r>
-      <w:r>
-        <w:rPr>
-          <w:rStyle w:val="SpecialCharTok"/>
-        </w:rPr>
-        <w:t xml:space="preserve">::</w:t>
-      </w:r>
-      <w:r>
-        <w:rPr>
-          <w:rStyle w:val="FunctionTok"/>
-        </w:rPr>
-        <w:t xml:space="preserve">na.omit</w:t>
-      </w:r>
-      <w:r>
-        <w:rPr>
-          <w:rStyle w:val="NormalTok"/>
-        </w:rPr>
-        <w:t xml:space="preserve">(ticker)</w:t>
-      </w:r>
-      <w:r>
-        <w:br/>
-      </w:r>
-      <w:r>
-        <w:br/>
-      </w:r>
-      <w:r>
-        <w:rPr>
-          <w:rStyle w:val="NormalTok"/>
-        </w:rPr>
-        <w:t xml:space="preserve">mv </w:t>
-      </w:r>
-      <w:r>
-        <w:rPr>
-          <w:rStyle w:val="OtherTok"/>
-        </w:rPr>
-        <w:t xml:space="preserve">&lt;-</w:t>
-      </w:r>
-      <w:r>
-        <w:rPr>
-          <w:rStyle w:val="NormalTok"/>
-        </w:rPr>
-        <w:t xml:space="preserve"> </w:t>
-      </w:r>
-      <w:r>
-        <w:rPr>
-          <w:rStyle w:val="FunctionTok"/>
-        </w:rPr>
-        <w:t xml:space="preserve">ts_data_mv</w:t>
-      </w:r>
-      <w:r>
-        <w:rPr>
-          <w:rStyle w:val="NormalTok"/>
-        </w:rPr>
-        <w:t xml:space="preserve">(</w:t>
-      </w:r>
-      <w:r>
-        <w:br/>
-      </w:r>
-      <w:r>
-        <w:rPr>
-          <w:rStyle w:val="NormalTok"/>
-        </w:rPr>
-        <w:t xml:space="preserve">  ticker,</w:t>
-      </w:r>
-      <w:r>
-        <w:br/>
-      </w:r>
-      <w:r>
-        <w:rPr>
-          <w:rStyle w:val="NormalTok"/>
-        </w:rPr>
-        <w:t xml:space="preserve">  </w:t>
-      </w:r>
-      <w:r>
-        <w:rPr>
-          <w:rStyle w:val="AttributeTok"/>
-        </w:rPr>
-        <w:t xml:space="preserve">y =</w:t>
-      </w:r>
-      <w:r>
-        <w:rPr>
-          <w:rStyle w:val="NormalTok"/>
-        </w:rPr>
-        <w:t xml:space="preserve"> </w:t>
-      </w:r>
-      <w:r>
-        <w:rPr>
-          <w:rStyle w:val="StringTok"/>
-        </w:rPr>
-        <w:t xml:space="preserve">"close"</w:t>
-      </w:r>
-      <w:r>
-        <w:rPr>
-          <w:rStyle w:val="NormalTok"/>
-        </w:rPr>
-        <w:t xml:space="preserve">,</w:t>
-      </w:r>
-      <w:r>
-        <w:br/>
-      </w:r>
-      <w:r>
-        <w:rPr>
-          <w:rStyle w:val="NormalTok"/>
-        </w:rPr>
-        <w:t xml:space="preserve">  </w:t>
-      </w:r>
-      <w:r>
-        <w:rPr>
-          <w:rStyle w:val="AttributeTok"/>
-        </w:rPr>
-        <w:t xml:space="preserve">x =</w:t>
-      </w:r>
-      <w:r>
-        <w:rPr>
-          <w:rStyle w:val="NormalTok"/>
-        </w:rPr>
-        <w:t xml:space="preserve"> </w:t>
-      </w:r>
-      <w:r>
-        <w:rPr>
-          <w:rStyle w:val="FunctionTok"/>
-        </w:rPr>
-        <w:t xml:space="preserve">c</w:t>
-      </w:r>
-      <w:r>
-        <w:rPr>
-          <w:rStyle w:val="NormalTok"/>
-        </w:rPr>
-        <w:t xml:space="preserve">(</w:t>
-      </w:r>
-      <w:r>
-        <w:rPr>
-          <w:rStyle w:val="StringTok"/>
-        </w:rPr>
-        <w:t xml:space="preserve">"open"</w:t>
-      </w:r>
-      <w:r>
-        <w:rPr>
-          <w:rStyle w:val="NormalTok"/>
-        </w:rPr>
-        <w:t xml:space="preserve">, </w:t>
-      </w:r>
-      <w:r>
-        <w:rPr>
-          <w:rStyle w:val="StringTok"/>
-        </w:rPr>
-        <w:t xml:space="preserve">"high"</w:t>
-      </w:r>
-      <w:r>
-        <w:rPr>
-          <w:rStyle w:val="NormalTok"/>
-        </w:rPr>
-        <w:t xml:space="preserve">, </w:t>
-      </w:r>
-      <w:r>
-        <w:rPr>
-          <w:rStyle w:val="StringTok"/>
-        </w:rPr>
-        <w:t xml:space="preserve">"low"</w:t>
-      </w:r>
-      <w:r>
-        <w:rPr>
-          <w:rStyle w:val="NormalTok"/>
-        </w:rPr>
-        <w:t xml:space="preserve">, </w:t>
-      </w:r>
-      <w:r>
-        <w:rPr>
-          <w:rStyle w:val="StringTok"/>
-        </w:rPr>
-        <w:t xml:space="preserve">"volume"</w:t>
-      </w:r>
-      <w:r>
-        <w:rPr>
-          <w:rStyle w:val="NormalTok"/>
-        </w:rPr>
-        <w:t xml:space="preserve">)</w:t>
-      </w:r>
-      <w:r>
-        <w:br/>
-      </w:r>
-      <w:r>
-        <w:rPr>
-          <w:rStyle w:val="NormalTok"/>
-        </w:rPr>
-        <w:t xml:space="preserve">)</w:t>
-      </w:r>
-      <w:r>
-        <w:br/>
-      </w:r>
-      <w:r>
-        <w:br/>
-      </w:r>
-      <w:r>
-        <w:rPr>
-          <w:rStyle w:val="FunctionTok"/>
-        </w:rPr>
-        <w:t xml:space="preserve">ts_head</w:t>
-      </w:r>
-      <w:r>
-        <w:rPr>
-          <w:rStyle w:val="NormalTok"/>
-        </w:rPr>
-        <w:t xml:space="preserve">(mv, </w:t>
-      </w:r>
-      <w:r>
-        <w:rPr>
-          <w:rStyle w:val="DecValTok"/>
-        </w:rPr>
-        <w:t xml:space="preserve">3</w:t>
-      </w:r>
-      <w:r>
-        <w:rPr>
-          <w:rStyle w:val="NormalTok"/>
-        </w:rPr>
-        <w:t xml:space="preserve">)</w:t>
+        <w:pStyle w:val="BodyText"/>
+      </w:pPr>
+      <w:r>
+        <w:t xml:space="preserve">For a faster didactic run, we keep only the last two years of valid</w:t>
+      </w:r>
+      <w:r>
+        <w:t xml:space="preserve"> </w:t>
+      </w:r>
+      <w:r>
+        <w:t xml:space="preserve">observations.</w:t>
       </w:r>
     </w:p>
     <w:p>
@@ -902,566 +326,1121 @@
       </w:pPr>
       <w:r>
         <w:rPr>
-          <w:rStyle w:val="VerbatimChar"/>
-        </w:rPr>
-        <w:t xml:space="preserve">##      close     open     high      low  volume</w:t>
-      </w:r>
-      <w:r>
-        <w:br/>
-      </w:r>
-      <w:r>
-        <w:rPr>
-          <w:rStyle w:val="VerbatimChar"/>
-        </w:rPr>
-        <w:t xml:space="preserve">## 1 3.500000 3.500000 3.542500 3.500000  585600</w:t>
-      </w:r>
-      <w:r>
-        <w:br/>
-      </w:r>
-      <w:r>
-        <w:rPr>
-          <w:rStyle w:val="VerbatimChar"/>
-        </w:rPr>
-        <w:t xml:space="preserve">## 2 3.416666 3.466666 3.474166 3.416666  782400</w:t>
-      </w:r>
-      <w:r>
-        <w:br/>
-      </w:r>
-      <w:r>
-        <w:rPr>
-          <w:rStyle w:val="VerbatimChar"/>
-        </w:rPr>
-        <w:t xml:space="preserve">## 3 3.416666 3.375000 3.416666 3.375000 1876800</w:t>
+          <w:rStyle w:val="FunctionTok"/>
+        </w:rPr>
+        <w:t xml:space="preserve">data</w:t>
+      </w:r>
+      <w:r>
+        <w:rPr>
+          <w:rStyle w:val="NormalTok"/>
+        </w:rPr>
+        <w:t xml:space="preserve">(stocks)</w:t>
+      </w:r>
+      <w:r>
+        <w:br/>
+      </w:r>
+      <w:r>
+        <w:br/>
+      </w:r>
+      <w:r>
+        <w:rPr>
+          <w:rStyle w:val="ControlFlowTok"/>
+        </w:rPr>
+        <w:t xml:space="preserve">if</w:t>
+      </w:r>
+      <w:r>
+        <w:rPr>
+          <w:rStyle w:val="NormalTok"/>
+        </w:rPr>
+        <w:t xml:space="preserve"> (</w:t>
+      </w:r>
+      <w:r>
+        <w:rPr>
+          <w:rStyle w:val="SpecialCharTok"/>
+        </w:rPr>
+        <w:t xml:space="preserve">!</w:t>
+      </w:r>
+      <w:r>
+        <w:rPr>
+          <w:rStyle w:val="FunctionTok"/>
+        </w:rPr>
+        <w:t xml:space="preserve">is.null</w:t>
+      </w:r>
+      <w:r>
+        <w:rPr>
+          <w:rStyle w:val="NormalTok"/>
+        </w:rPr>
+        <w:t xml:space="preserve">(</w:t>
+      </w:r>
+      <w:r>
+        <w:rPr>
+          <w:rStyle w:val="FunctionTok"/>
+        </w:rPr>
+        <w:t xml:space="preserve">attr</w:t>
+      </w:r>
+      <w:r>
+        <w:rPr>
+          <w:rStyle w:val="NormalTok"/>
+        </w:rPr>
+        <w:t xml:space="preserve">(stocks, </w:t>
+      </w:r>
+      <w:r>
+        <w:rPr>
+          <w:rStyle w:val="StringTok"/>
+        </w:rPr>
+        <w:t xml:space="preserve">"url"</w:t>
+      </w:r>
+      <w:r>
+        <w:rPr>
+          <w:rStyle w:val="NormalTok"/>
+        </w:rPr>
+        <w:t xml:space="preserve">))) {</w:t>
+      </w:r>
+      <w:r>
+        <w:br/>
+      </w:r>
+      <w:r>
+        <w:rPr>
+          <w:rStyle w:val="NormalTok"/>
+        </w:rPr>
+        <w:t xml:space="preserve">  stocks </w:t>
+      </w:r>
+      <w:r>
+        <w:rPr>
+          <w:rStyle w:val="OtherTok"/>
+        </w:rPr>
+        <w:t xml:space="preserve">&lt;-</w:t>
+      </w:r>
+      <w:r>
+        <w:rPr>
+          <w:rStyle w:val="NormalTok"/>
+        </w:rPr>
+        <w:t xml:space="preserve"> </w:t>
+      </w:r>
+      <w:r>
+        <w:rPr>
+          <w:rStyle w:val="FunctionTok"/>
+        </w:rPr>
+        <w:t xml:space="preserve">loadfulldata</w:t>
+      </w:r>
+      <w:r>
+        <w:rPr>
+          <w:rStyle w:val="NormalTok"/>
+        </w:rPr>
+        <w:t xml:space="preserve">(stocks)</w:t>
+      </w:r>
+      <w:r>
+        <w:br/>
+      </w:r>
+      <w:r>
+        <w:rPr>
+          <w:rStyle w:val="NormalTok"/>
+        </w:rPr>
+        <w:t xml:space="preserve">}</w:t>
+      </w:r>
+      <w:r>
+        <w:br/>
+      </w:r>
+      <w:r>
+        <w:br/>
+      </w:r>
+      <w:r>
+        <w:rPr>
+          <w:rStyle w:val="NormalTok"/>
+        </w:rPr>
+        <w:t xml:space="preserve">ticker_name </w:t>
+      </w:r>
+      <w:r>
+        <w:rPr>
+          <w:rStyle w:val="OtherTok"/>
+        </w:rPr>
+        <w:t xml:space="preserve">&lt;-</w:t>
+      </w:r>
+      <w:r>
+        <w:rPr>
+          <w:rStyle w:val="NormalTok"/>
+        </w:rPr>
+        <w:t xml:space="preserve"> </w:t>
+      </w:r>
+      <w:r>
+        <w:rPr>
+          <w:rStyle w:val="ControlFlowTok"/>
+        </w:rPr>
+        <w:t xml:space="preserve">if</w:t>
+      </w:r>
+      <w:r>
+        <w:rPr>
+          <w:rStyle w:val="NormalTok"/>
+        </w:rPr>
+        <w:t xml:space="preserve"> (</w:t>
+      </w:r>
+      <w:r>
+        <w:rPr>
+          <w:rStyle w:val="StringTok"/>
+        </w:rPr>
+        <w:t xml:space="preserve">"VALE3"</w:t>
+      </w:r>
+      <w:r>
+        <w:rPr>
+          <w:rStyle w:val="NormalTok"/>
+        </w:rPr>
+        <w:t xml:space="preserve"> </w:t>
+      </w:r>
+      <w:r>
+        <w:rPr>
+          <w:rStyle w:val="SpecialCharTok"/>
+        </w:rPr>
+        <w:t xml:space="preserve">%in%</w:t>
+      </w:r>
+      <w:r>
+        <w:rPr>
+          <w:rStyle w:val="NormalTok"/>
+        </w:rPr>
+        <w:t xml:space="preserve"> </w:t>
+      </w:r>
+      <w:r>
+        <w:rPr>
+          <w:rStyle w:val="FunctionTok"/>
+        </w:rPr>
+        <w:t xml:space="preserve">names</w:t>
+      </w:r>
+      <w:r>
+        <w:rPr>
+          <w:rStyle w:val="NormalTok"/>
+        </w:rPr>
+        <w:t xml:space="preserve">(stocks)) </w:t>
+      </w:r>
+      <w:r>
+        <w:rPr>
+          <w:rStyle w:val="StringTok"/>
+        </w:rPr>
+        <w:t xml:space="preserve">"VALE3"</w:t>
+      </w:r>
+      <w:r>
+        <w:rPr>
+          <w:rStyle w:val="NormalTok"/>
+        </w:rPr>
+        <w:t xml:space="preserve"> </w:t>
+      </w:r>
+      <w:r>
+        <w:rPr>
+          <w:rStyle w:val="ControlFlowTok"/>
+        </w:rPr>
+        <w:t xml:space="preserve">else</w:t>
+      </w:r>
+      <w:r>
+        <w:rPr>
+          <w:rStyle w:val="NormalTok"/>
+        </w:rPr>
+        <w:t xml:space="preserve"> </w:t>
+      </w:r>
+      <w:r>
+        <w:rPr>
+          <w:rStyle w:val="FunctionTok"/>
+        </w:rPr>
+        <w:t xml:space="preserve">names</w:t>
+      </w:r>
+      <w:r>
+        <w:rPr>
+          <w:rStyle w:val="NormalTok"/>
+        </w:rPr>
+        <w:t xml:space="preserve">(stocks)[</w:t>
+      </w:r>
+      <w:r>
+        <w:rPr>
+          <w:rStyle w:val="DecValTok"/>
+        </w:rPr>
+        <w:t xml:space="preserve">1</w:t>
+      </w:r>
+      <w:r>
+        <w:rPr>
+          <w:rStyle w:val="NormalTok"/>
+        </w:rPr>
+        <w:t xml:space="preserve">]</w:t>
+      </w:r>
+      <w:r>
+        <w:br/>
+      </w:r>
+      <w:r>
+        <w:rPr>
+          <w:rStyle w:val="NormalTok"/>
+        </w:rPr>
+        <w:t xml:space="preserve">ticker </w:t>
+      </w:r>
+      <w:r>
+        <w:rPr>
+          <w:rStyle w:val="OtherTok"/>
+        </w:rPr>
+        <w:t xml:space="preserve">&lt;-</w:t>
+      </w:r>
+      <w:r>
+        <w:rPr>
+          <w:rStyle w:val="NormalTok"/>
+        </w:rPr>
+        <w:t xml:space="preserve"> stocks[[ticker_name]]</w:t>
+      </w:r>
+      <w:r>
+        <w:br/>
+      </w:r>
+      <w:r>
+        <w:rPr>
+          <w:rStyle w:val="NormalTok"/>
+        </w:rPr>
+        <w:t xml:space="preserve">ticker </w:t>
+      </w:r>
+      <w:r>
+        <w:rPr>
+          <w:rStyle w:val="OtherTok"/>
+        </w:rPr>
+        <w:t xml:space="preserve">&lt;-</w:t>
+      </w:r>
+      <w:r>
+        <w:rPr>
+          <w:rStyle w:val="NormalTok"/>
+        </w:rPr>
+        <w:t xml:space="preserve"> ticker[, </w:t>
+      </w:r>
+      <w:r>
+        <w:rPr>
+          <w:rStyle w:val="FunctionTok"/>
+        </w:rPr>
+        <w:t xml:space="preserve">c</w:t>
+      </w:r>
+      <w:r>
+        <w:rPr>
+          <w:rStyle w:val="NormalTok"/>
+        </w:rPr>
+        <w:t xml:space="preserve">(</w:t>
+      </w:r>
+      <w:r>
+        <w:rPr>
+          <w:rStyle w:val="StringTok"/>
+        </w:rPr>
+        <w:t xml:space="preserve">"date"</w:t>
+      </w:r>
+      <w:r>
+        <w:rPr>
+          <w:rStyle w:val="NormalTok"/>
+        </w:rPr>
+        <w:t xml:space="preserve">, </w:t>
+      </w:r>
+      <w:r>
+        <w:rPr>
+          <w:rStyle w:val="StringTok"/>
+        </w:rPr>
+        <w:t xml:space="preserve">"open"</w:t>
+      </w:r>
+      <w:r>
+        <w:rPr>
+          <w:rStyle w:val="NormalTok"/>
+        </w:rPr>
+        <w:t xml:space="preserve">, </w:t>
+      </w:r>
+      <w:r>
+        <w:rPr>
+          <w:rStyle w:val="StringTok"/>
+        </w:rPr>
+        <w:t xml:space="preserve">"high"</w:t>
+      </w:r>
+      <w:r>
+        <w:rPr>
+          <w:rStyle w:val="NormalTok"/>
+        </w:rPr>
+        <w:t xml:space="preserve">, </w:t>
+      </w:r>
+      <w:r>
+        <w:rPr>
+          <w:rStyle w:val="StringTok"/>
+        </w:rPr>
+        <w:t xml:space="preserve">"low"</w:t>
+      </w:r>
+      <w:r>
+        <w:rPr>
+          <w:rStyle w:val="NormalTok"/>
+        </w:rPr>
+        <w:t xml:space="preserve">, </w:t>
+      </w:r>
+      <w:r>
+        <w:rPr>
+          <w:rStyle w:val="StringTok"/>
+        </w:rPr>
+        <w:t xml:space="preserve">"close"</w:t>
+      </w:r>
+      <w:r>
+        <w:rPr>
+          <w:rStyle w:val="NormalTok"/>
+        </w:rPr>
+        <w:t xml:space="preserve">, </w:t>
+      </w:r>
+      <w:r>
+        <w:rPr>
+          <w:rStyle w:val="StringTok"/>
+        </w:rPr>
+        <w:t xml:space="preserve">"volume"</w:t>
+      </w:r>
+      <w:r>
+        <w:rPr>
+          <w:rStyle w:val="NormalTok"/>
+        </w:rPr>
+        <w:t xml:space="preserve">)]</w:t>
+      </w:r>
+      <w:r>
+        <w:br/>
+      </w:r>
+      <w:r>
+        <w:rPr>
+          <w:rStyle w:val="NormalTok"/>
+        </w:rPr>
+        <w:t xml:space="preserve">ticker </w:t>
+      </w:r>
+      <w:r>
+        <w:rPr>
+          <w:rStyle w:val="OtherTok"/>
+        </w:rPr>
+        <w:t xml:space="preserve">&lt;-</w:t>
+      </w:r>
+      <w:r>
+        <w:rPr>
+          <w:rStyle w:val="NormalTok"/>
+        </w:rPr>
+        <w:t xml:space="preserve"> stats</w:t>
+      </w:r>
+      <w:r>
+        <w:rPr>
+          <w:rStyle w:val="SpecialCharTok"/>
+        </w:rPr>
+        <w:t xml:space="preserve">::</w:t>
+      </w:r>
+      <w:r>
+        <w:rPr>
+          <w:rStyle w:val="FunctionTok"/>
+        </w:rPr>
+        <w:t xml:space="preserve">na.omit</w:t>
+      </w:r>
+      <w:r>
+        <w:rPr>
+          <w:rStyle w:val="NormalTok"/>
+        </w:rPr>
+        <w:t xml:space="preserve">(ticker)</w:t>
+      </w:r>
+      <w:r>
+        <w:br/>
+      </w:r>
+      <w:r>
+        <w:rPr>
+          <w:rStyle w:val="NormalTok"/>
+        </w:rPr>
+        <w:t xml:space="preserve">ticker </w:t>
+      </w:r>
+      <w:r>
+        <w:rPr>
+          <w:rStyle w:val="OtherTok"/>
+        </w:rPr>
+        <w:t xml:space="preserve">&lt;-</w:t>
+      </w:r>
+      <w:r>
+        <w:rPr>
+          <w:rStyle w:val="NormalTok"/>
+        </w:rPr>
+        <w:t xml:space="preserve"> </w:t>
+      </w:r>
+      <w:r>
+        <w:rPr>
+          <w:rStyle w:val="FunctionTok"/>
+        </w:rPr>
+        <w:t xml:space="preserve">subset</w:t>
+      </w:r>
+      <w:r>
+        <w:rPr>
+          <w:rStyle w:val="NormalTok"/>
+        </w:rPr>
+        <w:t xml:space="preserve">(ticker, open </w:t>
+      </w:r>
+      <w:r>
+        <w:rPr>
+          <w:rStyle w:val="SpecialCharTok"/>
+        </w:rPr>
+        <w:t xml:space="preserve">&gt;</w:t>
+      </w:r>
+      <w:r>
+        <w:rPr>
+          <w:rStyle w:val="NormalTok"/>
+        </w:rPr>
+        <w:t xml:space="preserve"> </w:t>
+      </w:r>
+      <w:r>
+        <w:rPr>
+          <w:rStyle w:val="DecValTok"/>
+        </w:rPr>
+        <w:t xml:space="preserve">0</w:t>
+      </w:r>
+      <w:r>
+        <w:rPr>
+          <w:rStyle w:val="NormalTok"/>
+        </w:rPr>
+        <w:t xml:space="preserve"> </w:t>
+      </w:r>
+      <w:r>
+        <w:rPr>
+          <w:rStyle w:val="SpecialCharTok"/>
+        </w:rPr>
+        <w:t xml:space="preserve">&amp;</w:t>
+      </w:r>
+      <w:r>
+        <w:rPr>
+          <w:rStyle w:val="NormalTok"/>
+        </w:rPr>
+        <w:t xml:space="preserve"> high </w:t>
+      </w:r>
+      <w:r>
+        <w:rPr>
+          <w:rStyle w:val="SpecialCharTok"/>
+        </w:rPr>
+        <w:t xml:space="preserve">&gt;</w:t>
+      </w:r>
+      <w:r>
+        <w:rPr>
+          <w:rStyle w:val="NormalTok"/>
+        </w:rPr>
+        <w:t xml:space="preserve"> </w:t>
+      </w:r>
+      <w:r>
+        <w:rPr>
+          <w:rStyle w:val="DecValTok"/>
+        </w:rPr>
+        <w:t xml:space="preserve">0</w:t>
+      </w:r>
+      <w:r>
+        <w:rPr>
+          <w:rStyle w:val="NormalTok"/>
+        </w:rPr>
+        <w:t xml:space="preserve"> </w:t>
+      </w:r>
+      <w:r>
+        <w:rPr>
+          <w:rStyle w:val="SpecialCharTok"/>
+        </w:rPr>
+        <w:t xml:space="preserve">&amp;</w:t>
+      </w:r>
+      <w:r>
+        <w:rPr>
+          <w:rStyle w:val="NormalTok"/>
+        </w:rPr>
+        <w:t xml:space="preserve"> low </w:t>
+      </w:r>
+      <w:r>
+        <w:rPr>
+          <w:rStyle w:val="SpecialCharTok"/>
+        </w:rPr>
+        <w:t xml:space="preserve">&gt;</w:t>
+      </w:r>
+      <w:r>
+        <w:rPr>
+          <w:rStyle w:val="NormalTok"/>
+        </w:rPr>
+        <w:t xml:space="preserve"> </w:t>
+      </w:r>
+      <w:r>
+        <w:rPr>
+          <w:rStyle w:val="DecValTok"/>
+        </w:rPr>
+        <w:t xml:space="preserve">0</w:t>
+      </w:r>
+      <w:r>
+        <w:rPr>
+          <w:rStyle w:val="NormalTok"/>
+        </w:rPr>
+        <w:t xml:space="preserve"> </w:t>
+      </w:r>
+      <w:r>
+        <w:rPr>
+          <w:rStyle w:val="SpecialCharTok"/>
+        </w:rPr>
+        <w:t xml:space="preserve">&amp;</w:t>
+      </w:r>
+      <w:r>
+        <w:rPr>
+          <w:rStyle w:val="NormalTok"/>
+        </w:rPr>
+        <w:t xml:space="preserve"> volume </w:t>
+      </w:r>
+      <w:r>
+        <w:rPr>
+          <w:rStyle w:val="SpecialCharTok"/>
+        </w:rPr>
+        <w:t xml:space="preserve">&gt;</w:t>
+      </w:r>
+      <w:r>
+        <w:rPr>
+          <w:rStyle w:val="NormalTok"/>
+        </w:rPr>
+        <w:t xml:space="preserve"> </w:t>
+      </w:r>
+      <w:r>
+        <w:rPr>
+          <w:rStyle w:val="DecValTok"/>
+        </w:rPr>
+        <w:t xml:space="preserve">0</w:t>
+      </w:r>
+      <w:r>
+        <w:rPr>
+          <w:rStyle w:val="NormalTok"/>
+        </w:rPr>
+        <w:t xml:space="preserve">)</w:t>
+      </w:r>
+      <w:r>
+        <w:br/>
+      </w:r>
+      <w:r>
+        <w:rPr>
+          <w:rStyle w:val="NormalTok"/>
+        </w:rPr>
+        <w:t xml:space="preserve">cutoff_date </w:t>
+      </w:r>
+      <w:r>
+        <w:rPr>
+          <w:rStyle w:val="OtherTok"/>
+        </w:rPr>
+        <w:t xml:space="preserve">&lt;-</w:t>
+      </w:r>
+      <w:r>
+        <w:rPr>
+          <w:rStyle w:val="NormalTok"/>
+        </w:rPr>
+        <w:t xml:space="preserve"> </w:t>
+      </w:r>
+      <w:r>
+        <w:rPr>
+          <w:rStyle w:val="FunctionTok"/>
+        </w:rPr>
+        <w:t xml:space="preserve">max</w:t>
+      </w:r>
+      <w:r>
+        <w:rPr>
+          <w:rStyle w:val="NormalTok"/>
+        </w:rPr>
+        <w:t xml:space="preserve">(ticker</w:t>
+      </w:r>
+      <w:r>
+        <w:rPr>
+          <w:rStyle w:val="SpecialCharTok"/>
+        </w:rPr>
+        <w:t xml:space="preserve">$</w:t>
+      </w:r>
+      <w:r>
+        <w:rPr>
+          <w:rStyle w:val="NormalTok"/>
+        </w:rPr>
+        <w:t xml:space="preserve">date) </w:t>
+      </w:r>
+      <w:r>
+        <w:rPr>
+          <w:rStyle w:val="SpecialCharTok"/>
+        </w:rPr>
+        <w:t xml:space="preserve">-</w:t>
+      </w:r>
+      <w:r>
+        <w:rPr>
+          <w:rStyle w:val="NormalTok"/>
+        </w:rPr>
+        <w:t xml:space="preserve"> </w:t>
+      </w:r>
+      <w:r>
+        <w:rPr>
+          <w:rStyle w:val="DecValTok"/>
+        </w:rPr>
+        <w:t xml:space="preserve">365</w:t>
+      </w:r>
+      <w:r>
+        <w:rPr>
+          <w:rStyle w:val="NormalTok"/>
+        </w:rPr>
+        <w:t xml:space="preserve"> </w:t>
+      </w:r>
+      <w:r>
+        <w:rPr>
+          <w:rStyle w:val="SpecialCharTok"/>
+        </w:rPr>
+        <w:t xml:space="preserve">*</w:t>
+      </w:r>
+      <w:r>
+        <w:rPr>
+          <w:rStyle w:val="NormalTok"/>
+        </w:rPr>
+        <w:t xml:space="preserve"> </w:t>
+      </w:r>
+      <w:r>
+        <w:rPr>
+          <w:rStyle w:val="DecValTok"/>
+        </w:rPr>
+        <w:t xml:space="preserve">2</w:t>
+      </w:r>
+      <w:r>
+        <w:br/>
+      </w:r>
+      <w:r>
+        <w:rPr>
+          <w:rStyle w:val="NormalTok"/>
+        </w:rPr>
+        <w:t xml:space="preserve">ticker </w:t>
+      </w:r>
+      <w:r>
+        <w:rPr>
+          <w:rStyle w:val="OtherTok"/>
+        </w:rPr>
+        <w:t xml:space="preserve">&lt;-</w:t>
+      </w:r>
+      <w:r>
+        <w:rPr>
+          <w:rStyle w:val="NormalTok"/>
+        </w:rPr>
+        <w:t xml:space="preserve"> ticker[ticker</w:t>
+      </w:r>
+      <w:r>
+        <w:rPr>
+          <w:rStyle w:val="SpecialCharTok"/>
+        </w:rPr>
+        <w:t xml:space="preserve">$</w:t>
+      </w:r>
+      <w:r>
+        <w:rPr>
+          <w:rStyle w:val="NormalTok"/>
+        </w:rPr>
+        <w:t xml:space="preserve">date </w:t>
+      </w:r>
+      <w:r>
+        <w:rPr>
+          <w:rStyle w:val="SpecialCharTok"/>
+        </w:rPr>
+        <w:t xml:space="preserve">&gt;</w:t>
+      </w:r>
+      <w:r>
+        <w:rPr>
+          <w:rStyle w:val="NormalTok"/>
+        </w:rPr>
+        <w:t xml:space="preserve"> cutoff_date, ]</w:t>
+      </w:r>
+      <w:r>
+        <w:br/>
+      </w:r>
+      <w:r>
+        <w:br/>
+      </w:r>
+      <w:r>
+        <w:rPr>
+          <w:rStyle w:val="NormalTok"/>
+        </w:rPr>
+        <w:t xml:space="preserve">mv </w:t>
+      </w:r>
+      <w:r>
+        <w:rPr>
+          <w:rStyle w:val="OtherTok"/>
+        </w:rPr>
+        <w:t xml:space="preserve">&lt;-</w:t>
+      </w:r>
+      <w:r>
+        <w:rPr>
+          <w:rStyle w:val="NormalTok"/>
+        </w:rPr>
+        <w:t xml:space="preserve"> </w:t>
+      </w:r>
+      <w:r>
+        <w:rPr>
+          <w:rStyle w:val="FunctionTok"/>
+        </w:rPr>
+        <w:t xml:space="preserve">ts_data_mv</w:t>
+      </w:r>
+      <w:r>
+        <w:rPr>
+          <w:rStyle w:val="NormalTok"/>
+        </w:rPr>
+        <w:t xml:space="preserve">(</w:t>
+      </w:r>
+      <w:r>
+        <w:br/>
+      </w:r>
+      <w:r>
+        <w:rPr>
+          <w:rStyle w:val="NormalTok"/>
+        </w:rPr>
+        <w:t xml:space="preserve">  ticker[, </w:t>
+      </w:r>
+      <w:r>
+        <w:rPr>
+          <w:rStyle w:val="FunctionTok"/>
+        </w:rPr>
+        <w:t xml:space="preserve">c</w:t>
+      </w:r>
+      <w:r>
+        <w:rPr>
+          <w:rStyle w:val="NormalTok"/>
+        </w:rPr>
+        <w:t xml:space="preserve">(</w:t>
+      </w:r>
+      <w:r>
+        <w:rPr>
+          <w:rStyle w:val="StringTok"/>
+        </w:rPr>
+        <w:t xml:space="preserve">"open"</w:t>
+      </w:r>
+      <w:r>
+        <w:rPr>
+          <w:rStyle w:val="NormalTok"/>
+        </w:rPr>
+        <w:t xml:space="preserve">, </w:t>
+      </w:r>
+      <w:r>
+        <w:rPr>
+          <w:rStyle w:val="StringTok"/>
+        </w:rPr>
+        <w:t xml:space="preserve">"high"</w:t>
+      </w:r>
+      <w:r>
+        <w:rPr>
+          <w:rStyle w:val="NormalTok"/>
+        </w:rPr>
+        <w:t xml:space="preserve">, </w:t>
+      </w:r>
+      <w:r>
+        <w:rPr>
+          <w:rStyle w:val="StringTok"/>
+        </w:rPr>
+        <w:t xml:space="preserve">"low"</w:t>
+      </w:r>
+      <w:r>
+        <w:rPr>
+          <w:rStyle w:val="NormalTok"/>
+        </w:rPr>
+        <w:t xml:space="preserve">, </w:t>
+      </w:r>
+      <w:r>
+        <w:rPr>
+          <w:rStyle w:val="StringTok"/>
+        </w:rPr>
+        <w:t xml:space="preserve">"close"</w:t>
+      </w:r>
+      <w:r>
+        <w:rPr>
+          <w:rStyle w:val="NormalTok"/>
+        </w:rPr>
+        <w:t xml:space="preserve">, </w:t>
+      </w:r>
+      <w:r>
+        <w:rPr>
+          <w:rStyle w:val="StringTok"/>
+        </w:rPr>
+        <w:t xml:space="preserve">"volume"</w:t>
+      </w:r>
+      <w:r>
+        <w:rPr>
+          <w:rStyle w:val="NormalTok"/>
+        </w:rPr>
+        <w:t xml:space="preserve">)],</w:t>
+      </w:r>
+      <w:r>
+        <w:br/>
+      </w:r>
+      <w:r>
+        <w:rPr>
+          <w:rStyle w:val="NormalTok"/>
+        </w:rPr>
+        <w:t xml:space="preserve">  </w:t>
+      </w:r>
+      <w:r>
+        <w:rPr>
+          <w:rStyle w:val="AttributeTok"/>
+        </w:rPr>
+        <w:t xml:space="preserve">y =</w:t>
+      </w:r>
+      <w:r>
+        <w:rPr>
+          <w:rStyle w:val="NormalTok"/>
+        </w:rPr>
+        <w:t xml:space="preserve"> </w:t>
+      </w:r>
+      <w:r>
+        <w:rPr>
+          <w:rStyle w:val="StringTok"/>
+        </w:rPr>
+        <w:t xml:space="preserve">"close"</w:t>
+      </w:r>
+      <w:r>
+        <w:rPr>
+          <w:rStyle w:val="NormalTok"/>
+        </w:rPr>
+        <w:t xml:space="preserve">,</w:t>
+      </w:r>
+      <w:r>
+        <w:br/>
+      </w:r>
+      <w:r>
+        <w:rPr>
+          <w:rStyle w:val="NormalTok"/>
+        </w:rPr>
+        <w:t xml:space="preserve">  </w:t>
+      </w:r>
+      <w:r>
+        <w:rPr>
+          <w:rStyle w:val="AttributeTok"/>
+        </w:rPr>
+        <w:t xml:space="preserve">x =</w:t>
+      </w:r>
+      <w:r>
+        <w:rPr>
+          <w:rStyle w:val="NormalTok"/>
+        </w:rPr>
+        <w:t xml:space="preserve"> </w:t>
+      </w:r>
+      <w:r>
+        <w:rPr>
+          <w:rStyle w:val="FunctionTok"/>
+        </w:rPr>
+        <w:t xml:space="preserve">c</w:t>
+      </w:r>
+      <w:r>
+        <w:rPr>
+          <w:rStyle w:val="NormalTok"/>
+        </w:rPr>
+        <w:t xml:space="preserve">(</w:t>
+      </w:r>
+      <w:r>
+        <w:rPr>
+          <w:rStyle w:val="StringTok"/>
+        </w:rPr>
+        <w:t xml:space="preserve">"open"</w:t>
+      </w:r>
+      <w:r>
+        <w:rPr>
+          <w:rStyle w:val="NormalTok"/>
+        </w:rPr>
+        <w:t xml:space="preserve">, </w:t>
+      </w:r>
+      <w:r>
+        <w:rPr>
+          <w:rStyle w:val="StringTok"/>
+        </w:rPr>
+        <w:t xml:space="preserve">"high"</w:t>
+      </w:r>
+      <w:r>
+        <w:rPr>
+          <w:rStyle w:val="NormalTok"/>
+        </w:rPr>
+        <w:t xml:space="preserve">, </w:t>
+      </w:r>
+      <w:r>
+        <w:rPr>
+          <w:rStyle w:val="StringTok"/>
+        </w:rPr>
+        <w:t xml:space="preserve">"low"</w:t>
+      </w:r>
+      <w:r>
+        <w:rPr>
+          <w:rStyle w:val="NormalTok"/>
+        </w:rPr>
+        <w:t xml:space="preserve">, </w:t>
+      </w:r>
+      <w:r>
+        <w:rPr>
+          <w:rStyle w:val="StringTok"/>
+        </w:rPr>
+        <w:t xml:space="preserve">"volume"</w:t>
+      </w:r>
+      <w:r>
+        <w:rPr>
+          <w:rStyle w:val="NormalTok"/>
+        </w:rPr>
+        <w:t xml:space="preserve">)</w:t>
+      </w:r>
+      <w:r>
+        <w:br/>
+      </w:r>
+      <w:r>
+        <w:rPr>
+          <w:rStyle w:val="NormalTok"/>
+        </w:rPr>
+        <w:t xml:space="preserve">)</w:t>
+      </w:r>
+      <w:r>
+        <w:br/>
+      </w:r>
+      <w:r>
+        <w:br/>
+      </w:r>
+      <w:r>
+        <w:rPr>
+          <w:rStyle w:val="FunctionTok"/>
+        </w:rPr>
+        <w:t xml:space="preserve">ts_head</w:t>
+      </w:r>
+      <w:r>
+        <w:rPr>
+          <w:rStyle w:val="NormalTok"/>
+        </w:rPr>
+        <w:t xml:space="preserve">(mv, </w:t>
+      </w:r>
+      <w:r>
+        <w:rPr>
+          <w:rStyle w:val="DecValTok"/>
+        </w:rPr>
+        <w:t xml:space="preserve">3</w:t>
+      </w:r>
+      <w:r>
+        <w:rPr>
+          <w:rStyle w:val="NormalTok"/>
+        </w:rPr>
+        <w:t xml:space="preserve">)</w:t>
       </w:r>
     </w:p>
     <w:p>
       <w:pPr>
-        <w:pStyle w:val="FirstParagraph"/>
-      </w:pPr>
-      <w:r>
-        <w:t xml:space="preserve">The aligned object can now be split in time just like any other target-centered</w:t>
-      </w:r>
-      <w:r>
-        <w:t xml:space="preserve"> </w:t>
-      </w:r>
-      <w:r>
-        <w:t xml:space="preserve">multivariate dataset.</w:t>
+        <w:pStyle w:val="SourceCode"/>
+      </w:pPr>
+      <w:r>
+        <w:rPr>
+          <w:rStyle w:val="VerbatimChar"/>
+        </w:rPr>
+        <w:t xml:space="preserve">##      close  open  high   low   volume</w:t>
+      </w:r>
+      <w:r>
+        <w:br/>
+      </w:r>
+      <w:r>
+        <w:rPr>
+          <w:rStyle w:val="VerbatimChar"/>
+        </w:rPr>
+        <w:t xml:space="preserve">## 6057 65.72 65.99 66.14 65.51 12497900</w:t>
+      </w:r>
+      <w:r>
+        <w:br/>
+      </w:r>
+      <w:r>
+        <w:rPr>
+          <w:rStyle w:val="VerbatimChar"/>
+        </w:rPr>
+        <w:t xml:space="preserve">## 6058 65.51 65.50 65.87 65.04 17360200</w:t>
+      </w:r>
+      <w:r>
+        <w:br/>
+      </w:r>
+      <w:r>
+        <w:rPr>
+          <w:rStyle w:val="VerbatimChar"/>
+        </w:rPr>
+        <w:t xml:space="preserve">## 6059 68.00 66.49 68.32 66.34 40947100</w:t>
       </w:r>
     </w:p>
     <w:p>
       <w:pPr>
-        <w:pStyle w:val="SourceCode"/>
-      </w:pPr>
-      <w:r>
-        <w:rPr>
-          <w:rStyle w:val="NormalTok"/>
-        </w:rPr>
-        <w:t xml:space="preserve">samp </w:t>
-      </w:r>
-      <w:r>
-        <w:rPr>
-          <w:rStyle w:val="OtherTok"/>
-        </w:rPr>
-        <w:t xml:space="preserve">&lt;-</w:t>
-      </w:r>
-      <w:r>
-        <w:rPr>
-          <w:rStyle w:val="NormalTok"/>
-        </w:rPr>
-        <w:t xml:space="preserve"> </w:t>
-      </w:r>
-      <w:r>
-        <w:rPr>
-          <w:rStyle w:val="FunctionTok"/>
-        </w:rPr>
-        <w:t xml:space="preserve">ts_sample</w:t>
-      </w:r>
-      <w:r>
-        <w:rPr>
-          <w:rStyle w:val="NormalTok"/>
-        </w:rPr>
-        <w:t xml:space="preserve">(mv, </w:t>
-      </w:r>
-      <w:r>
-        <w:rPr>
-          <w:rStyle w:val="AttributeTok"/>
-        </w:rPr>
-        <w:t xml:space="preserve">test_size =</w:t>
-      </w:r>
-      <w:r>
-        <w:rPr>
-          <w:rStyle w:val="NormalTok"/>
-        </w:rPr>
-        <w:t xml:space="preserve"> </w:t>
-      </w:r>
-      <w:r>
-        <w:rPr>
-          <w:rStyle w:val="DecValTok"/>
-        </w:rPr>
-        <w:t xml:space="preserve">5</w:t>
-      </w:r>
-      <w:r>
-        <w:rPr>
-          <w:rStyle w:val="NormalTok"/>
-        </w:rPr>
-        <w:t xml:space="preserve">)</w:t>
+        <w:pStyle w:val="FirstParagraph"/>
+      </w:pPr>
+      <w:r>
+        <w:t xml:space="preserve">The aligned object can now be split in time just like any other target-centered</w:t>
+      </w:r>
+      <w:r>
+        <w:t xml:space="preserve"> </w:t>
+      </w:r>
+      <w:r>
+        <w:t xml:space="preserve">multivariate dataset.</w:t>
       </w:r>
     </w:p>
     <w:p>
       <w:pPr>
-        <w:pStyle w:val="FirstParagraph"/>
-      </w:pPr>
-      <w:r>
-        <w:t xml:space="preserve">Before introducing the multivariate workflow, we build a direct univariate</w:t>
-      </w:r>
-      <w:r>
-        <w:t xml:space="preserve"> </w:t>
-      </w:r>
-      <w:r>
-        <w:t xml:space="preserve">baseline on the closing price itself. This keeps the interpretation honest: we</w:t>
-      </w:r>
-      <w:r>
-        <w:t xml:space="preserve"> </w:t>
-      </w:r>
-      <w:r>
-        <w:t xml:space="preserve">first ask how far a classical</w:t>
-      </w:r>
-      <w:r>
-        <w:t xml:space="preserve"> </w:t>
-      </w:r>
-      <w:r>
-        <w:rPr>
-          <w:rStyle w:val="VerbatimChar"/>
-        </w:rPr>
-        <w:t xml:space="preserve">ARIMA</w:t>
-      </w:r>
-      <w:r>
-        <w:t xml:space="preserve"> </w:t>
-      </w:r>
-      <w:r>
-        <w:t xml:space="preserve">can go before bringing in the auxiliary</w:t>
-      </w:r>
-      <w:r>
-        <w:t xml:space="preserve"> </w:t>
-      </w:r>
-      <w:r>
-        <w:t xml:space="preserve">variables.</w:t>
+        <w:pStyle w:val="SourceCode"/>
+      </w:pPr>
+      <w:r>
+        <w:rPr>
+          <w:rStyle w:val="NormalTok"/>
+        </w:rPr>
+        <w:t xml:space="preserve">samp </w:t>
+      </w:r>
+      <w:r>
+        <w:rPr>
+          <w:rStyle w:val="OtherTok"/>
+        </w:rPr>
+        <w:t xml:space="preserve">&lt;-</w:t>
+      </w:r>
+      <w:r>
+        <w:rPr>
+          <w:rStyle w:val="NormalTok"/>
+        </w:rPr>
+        <w:t xml:space="preserve"> </w:t>
+      </w:r>
+      <w:r>
+        <w:rPr>
+          <w:rStyle w:val="FunctionTok"/>
+        </w:rPr>
+        <w:t xml:space="preserve">ts_sample</w:t>
+      </w:r>
+      <w:r>
+        <w:rPr>
+          <w:rStyle w:val="NormalTok"/>
+        </w:rPr>
+        <w:t xml:space="preserve">(mv, </w:t>
+      </w:r>
+      <w:r>
+        <w:rPr>
+          <w:rStyle w:val="AttributeTok"/>
+        </w:rPr>
+        <w:t xml:space="preserve">test_size =</w:t>
+      </w:r>
+      <w:r>
+        <w:rPr>
+          <w:rStyle w:val="NormalTok"/>
+        </w:rPr>
+        <w:t xml:space="preserve"> </w:t>
+      </w:r>
+      <w:r>
+        <w:rPr>
+          <w:rStyle w:val="DecValTok"/>
+        </w:rPr>
+        <w:t xml:space="preserve">5</w:t>
+      </w:r>
+      <w:r>
+        <w:rPr>
+          <w:rStyle w:val="NormalTok"/>
+        </w:rPr>
+        <w:t xml:space="preserve">)</w:t>
       </w:r>
     </w:p>
     <w:p>
       <w:pPr>
-        <w:pStyle w:val="SourceCode"/>
-      </w:pPr>
-      <w:r>
-        <w:rPr>
-          <w:rStyle w:val="NormalTok"/>
-        </w:rPr>
-        <w:t xml:space="preserve">close_ts </w:t>
-      </w:r>
-      <w:r>
-        <w:rPr>
-          <w:rStyle w:val="OtherTok"/>
-        </w:rPr>
-        <w:t xml:space="preserve">&lt;-</w:t>
-      </w:r>
-      <w:r>
-        <w:rPr>
-          <w:rStyle w:val="NormalTok"/>
-        </w:rPr>
-        <w:t xml:space="preserve"> </w:t>
-      </w:r>
-      <w:r>
-        <w:rPr>
-          <w:rStyle w:val="FunctionTok"/>
-        </w:rPr>
-        <w:t xml:space="preserve">ts_data</w:t>
-      </w:r>
-      <w:r>
-        <w:rPr>
-          <w:rStyle w:val="NormalTok"/>
-        </w:rPr>
-        <w:t xml:space="preserve">(ticker</w:t>
-      </w:r>
-      <w:r>
-        <w:rPr>
-          <w:rStyle w:val="SpecialCharTok"/>
-        </w:rPr>
-        <w:t xml:space="preserve">$</w:t>
-      </w:r>
-      <w:r>
-        <w:rPr>
-          <w:rStyle w:val="NormalTok"/>
-        </w:rPr>
-        <w:t xml:space="preserve">close, </w:t>
-      </w:r>
-      <w:r>
-        <w:rPr>
-          <w:rStyle w:val="DecValTok"/>
-        </w:rPr>
-        <w:t xml:space="preserve">1</w:t>
-      </w:r>
-      <w:r>
-        <w:rPr>
-          <w:rStyle w:val="NormalTok"/>
-        </w:rPr>
-        <w:t xml:space="preserve">)</w:t>
-      </w:r>
-      <w:r>
-        <w:br/>
-      </w:r>
-      <w:r>
-        <w:rPr>
-          <w:rStyle w:val="NormalTok"/>
-        </w:rPr>
-        <w:t xml:space="preserve">close_samp </w:t>
-      </w:r>
-      <w:r>
-        <w:rPr>
-          <w:rStyle w:val="OtherTok"/>
-        </w:rPr>
-        <w:t xml:space="preserve">&lt;-</w:t>
-      </w:r>
-      <w:r>
-        <w:rPr>
-          <w:rStyle w:val="NormalTok"/>
-        </w:rPr>
-        <w:t xml:space="preserve"> </w:t>
-      </w:r>
-      <w:r>
-        <w:rPr>
-          <w:rStyle w:val="FunctionTok"/>
-        </w:rPr>
-        <w:t xml:space="preserve">ts_sample</w:t>
-      </w:r>
-      <w:r>
-        <w:rPr>
-          <w:rStyle w:val="NormalTok"/>
-        </w:rPr>
-        <w:t xml:space="preserve">(close_ts, </w:t>
-      </w:r>
-      <w:r>
-        <w:rPr>
-          <w:rStyle w:val="AttributeTok"/>
-        </w:rPr>
-        <w:t xml:space="preserve">test_size =</w:t>
-      </w:r>
-      <w:r>
-        <w:rPr>
-          <w:rStyle w:val="NormalTok"/>
-        </w:rPr>
-        <w:t xml:space="preserve"> </w:t>
-      </w:r>
-      <w:r>
-        <w:rPr>
-          <w:rStyle w:val="DecValTok"/>
-        </w:rPr>
-        <w:t xml:space="preserve">5</w:t>
-      </w:r>
-      <w:r>
-        <w:rPr>
-          <w:rStyle w:val="NormalTok"/>
-        </w:rPr>
-        <w:t xml:space="preserve">)</w:t>
-      </w:r>
-      <w:r>
-        <w:br/>
-      </w:r>
-      <w:r>
-        <w:br/>
-      </w:r>
-      <w:r>
-        <w:rPr>
-          <w:rStyle w:val="NormalTok"/>
-        </w:rPr>
-        <w:t xml:space="preserve">arima_baseline </w:t>
-      </w:r>
-      <w:r>
-        <w:rPr>
-          <w:rStyle w:val="OtherTok"/>
-        </w:rPr>
-        <w:t xml:space="preserve">&lt;-</w:t>
-      </w:r>
-      <w:r>
-        <w:rPr>
-          <w:rStyle w:val="NormalTok"/>
-        </w:rPr>
-        <w:t xml:space="preserve"> </w:t>
-      </w:r>
-      <w:r>
-        <w:rPr>
-          <w:rStyle w:val="FunctionTok"/>
-        </w:rPr>
-        <w:t xml:space="preserve">ts_arima</w:t>
-      </w:r>
-      <w:r>
-        <w:rPr>
-          <w:rStyle w:val="NormalTok"/>
-        </w:rPr>
-        <w:t xml:space="preserve">()</w:t>
-      </w:r>
-      <w:r>
-        <w:br/>
-      </w:r>
-      <w:r>
-        <w:rPr>
-          <w:rStyle w:val="NormalTok"/>
-        </w:rPr>
-        <w:t xml:space="preserve">arima_baseline </w:t>
-      </w:r>
-      <w:r>
-        <w:rPr>
-          <w:rStyle w:val="OtherTok"/>
-        </w:rPr>
-        <w:t xml:space="preserve">&lt;-</w:t>
-      </w:r>
-      <w:r>
-        <w:rPr>
-          <w:rStyle w:val="NormalTok"/>
-        </w:rPr>
-        <w:t xml:space="preserve"> </w:t>
-      </w:r>
-      <w:r>
-        <w:rPr>
-          <w:rStyle w:val="FunctionTok"/>
-        </w:rPr>
-        <w:t xml:space="preserve">fit</w:t>
-      </w:r>
-      <w:r>
-        <w:rPr>
-          <w:rStyle w:val="NormalTok"/>
-        </w:rPr>
-        <w:t xml:space="preserve">(arima_baseline, </w:t>
-      </w:r>
-      <w:r>
-        <w:rPr>
-          <w:rStyle w:val="AttributeTok"/>
-        </w:rPr>
-        <w:t xml:space="preserve">x =</w:t>
-      </w:r>
-      <w:r>
-        <w:rPr>
-          <w:rStyle w:val="NormalTok"/>
-        </w:rPr>
-        <w:t xml:space="preserve"> close_samp</w:t>
-      </w:r>
-      <w:r>
-        <w:rPr>
-          <w:rStyle w:val="SpecialCharTok"/>
-        </w:rPr>
-        <w:t xml:space="preserve">$</w:t>
-      </w:r>
-      <w:r>
-        <w:rPr>
-          <w:rStyle w:val="NormalTok"/>
-        </w:rPr>
-        <w:t xml:space="preserve">train)</w:t>
-      </w:r>
-      <w:r>
-        <w:br/>
-      </w:r>
-      <w:r>
-        <w:br/>
-      </w:r>
-      <w:r>
-        <w:rPr>
-          <w:rStyle w:val="NormalTok"/>
-        </w:rPr>
-        <w:t xml:space="preserve">pred_arima </w:t>
-      </w:r>
-      <w:r>
-        <w:rPr>
-          <w:rStyle w:val="OtherTok"/>
-        </w:rPr>
-        <w:t xml:space="preserve">&lt;-</w:t>
-      </w:r>
-      <w:r>
-        <w:rPr>
-          <w:rStyle w:val="NormalTok"/>
-        </w:rPr>
-        <w:t xml:space="preserve"> </w:t>
-      </w:r>
-      <w:r>
-        <w:rPr>
-          <w:rStyle w:val="FunctionTok"/>
-        </w:rPr>
-        <w:t xml:space="preserve">predict</w:t>
-      </w:r>
-      <w:r>
-        <w:rPr>
-          <w:rStyle w:val="NormalTok"/>
-        </w:rPr>
-        <w:t xml:space="preserve">(arima_baseline, </w:t>
-      </w:r>
-      <w:r>
-        <w:rPr>
-          <w:rStyle w:val="AttributeTok"/>
-        </w:rPr>
-        <w:t xml:space="preserve">x =</w:t>
-      </w:r>
-      <w:r>
-        <w:rPr>
-          <w:rStyle w:val="NormalTok"/>
-        </w:rPr>
-        <w:t xml:space="preserve"> close_samp</w:t>
-      </w:r>
-      <w:r>
-        <w:rPr>
-          <w:rStyle w:val="SpecialCharTok"/>
-        </w:rPr>
-        <w:t xml:space="preserve">$</w:t>
-      </w:r>
-      <w:r>
-        <w:rPr>
-          <w:rStyle w:val="NormalTok"/>
-        </w:rPr>
-        <w:t xml:space="preserve">test[</w:t>
-      </w:r>
-      <w:r>
-        <w:rPr>
-          <w:rStyle w:val="DecValTok"/>
-        </w:rPr>
-        <w:t xml:space="preserve">1</w:t>
-      </w:r>
-      <w:r>
-        <w:rPr>
-          <w:rStyle w:val="NormalTok"/>
-        </w:rPr>
-        <w:t xml:space="preserve">,], </w:t>
-      </w:r>
-      <w:r>
-        <w:rPr>
-          <w:rStyle w:val="AttributeTok"/>
-        </w:rPr>
-        <w:t xml:space="preserve">steps_ahead =</w:t>
-      </w:r>
-      <w:r>
-        <w:rPr>
-          <w:rStyle w:val="NormalTok"/>
-        </w:rPr>
-        <w:t xml:space="preserve"> </w:t>
-      </w:r>
-      <w:r>
-        <w:rPr>
-          <w:rStyle w:val="DecValTok"/>
-        </w:rPr>
-        <w:t xml:space="preserve">5</w:t>
-      </w:r>
-      <w:r>
-        <w:rPr>
-          <w:rStyle w:val="NormalTok"/>
-        </w:rPr>
-        <w:t xml:space="preserve">)</w:t>
-      </w:r>
-      <w:r>
-        <w:br/>
-      </w:r>
-      <w:r>
-        <w:rPr>
-          <w:rStyle w:val="NormalTok"/>
-        </w:rPr>
-        <w:t xml:space="preserve">pred_arima </w:t>
-      </w:r>
-      <w:r>
-        <w:rPr>
-          <w:rStyle w:val="OtherTok"/>
-        </w:rPr>
-        <w:t xml:space="preserve">&lt;-</w:t>
-      </w:r>
-      <w:r>
-        <w:rPr>
-          <w:rStyle w:val="NormalTok"/>
-        </w:rPr>
-        <w:t xml:space="preserve"> </w:t>
-      </w:r>
-      <w:r>
-        <w:rPr>
-          <w:rStyle w:val="FunctionTok"/>
-        </w:rPr>
-        <w:t xml:space="preserve">as.vector</w:t>
-      </w:r>
-      <w:r>
-        <w:rPr>
-          <w:rStyle w:val="NormalTok"/>
-        </w:rPr>
-        <w:t xml:space="preserve">(pred_arima)</w:t>
-      </w:r>
-      <w:r>
-        <w:br/>
-      </w:r>
-      <w:r>
-        <w:rPr>
-          <w:rStyle w:val="NormalTok"/>
-        </w:rPr>
-        <w:t xml:space="preserve">ev_arima </w:t>
-      </w:r>
-      <w:r>
-        <w:rPr>
-          <w:rStyle w:val="OtherTok"/>
-        </w:rPr>
-        <w:t xml:space="preserve">&lt;-</w:t>
-      </w:r>
-      <w:r>
-        <w:rPr>
-          <w:rStyle w:val="NormalTok"/>
-        </w:rPr>
-        <w:t xml:space="preserve"> </w:t>
-      </w:r>
-      <w:r>
-        <w:rPr>
-          <w:rStyle w:val="FunctionTok"/>
-        </w:rPr>
-        <w:t xml:space="preserve">evaluate</w:t>
-      </w:r>
-      <w:r>
-        <w:rPr>
-          <w:rStyle w:val="NormalTok"/>
-        </w:rPr>
-        <w:t xml:space="preserve">(arima_baseline, </w:t>
-      </w:r>
-      <w:r>
-        <w:rPr>
-          <w:rStyle w:val="FunctionTok"/>
-        </w:rPr>
-        <w:t xml:space="preserve">as.vector</w:t>
-      </w:r>
-      <w:r>
-        <w:rPr>
-          <w:rStyle w:val="NormalTok"/>
-        </w:rPr>
-        <w:t xml:space="preserve">(close_samp</w:t>
-      </w:r>
-      <w:r>
-        <w:rPr>
-          <w:rStyle w:val="SpecialCharTok"/>
-        </w:rPr>
-        <w:t xml:space="preserve">$</w:t>
-      </w:r>
-      <w:r>
-        <w:rPr>
-          <w:rStyle w:val="NormalTok"/>
-        </w:rPr>
-        <w:t xml:space="preserve">test), pred_arima)</w:t>
-      </w:r>
-      <w:r>
-        <w:br/>
-      </w:r>
-      <w:r>
-        <w:rPr>
-          <w:rStyle w:val="NormalTok"/>
-        </w:rPr>
-        <w:t xml:space="preserve">ev_arima</w:t>
-      </w:r>
-      <w:r>
-        <w:rPr>
-          <w:rStyle w:val="SpecialCharTok"/>
-        </w:rPr>
-        <w:t xml:space="preserve">$</w:t>
-      </w:r>
-      <w:r>
-        <w:rPr>
-          <w:rStyle w:val="NormalTok"/>
-        </w:rPr>
-        <w:t xml:space="preserve">metrics</w:t>
+        <w:pStyle w:val="FirstParagraph"/>
+      </w:pPr>
+      <w:r>
+        <w:t xml:space="preserve">Before introducing the multivariate workflow, we build a direct univariate</w:t>
+      </w:r>
+      <w:r>
+        <w:t xml:space="preserve"> </w:t>
+      </w:r>
+      <w:r>
+        <w:t xml:space="preserve">baseline on the closing price itself. This keeps the interpretation honest: we</w:t>
+      </w:r>
+      <w:r>
+        <w:t xml:space="preserve"> </w:t>
+      </w:r>
+      <w:r>
+        <w:t xml:space="preserve">first ask how far a classical</w:t>
+      </w:r>
+      <w:r>
+        <w:t xml:space="preserve"> </w:t>
+      </w:r>
+      <w:r>
+        <w:rPr>
+          <w:rStyle w:val="VerbatimChar"/>
+        </w:rPr>
+        <w:t xml:space="preserve">ARIMA</w:t>
+      </w:r>
+      <w:r>
+        <w:t xml:space="preserve"> </w:t>
+      </w:r>
+      <w:r>
+        <w:t xml:space="preserve">can go before bringing in the auxiliary</w:t>
+      </w:r>
+      <w:r>
+        <w:t xml:space="preserve"> </w:t>
+      </w:r>
+      <w:r>
+        <w:t xml:space="preserve">variables.</w:t>
       </w:r>
     </w:p>
     <w:p>
@@ -1470,6 +1449,422 @@
       </w:pPr>
       <w:r>
         <w:rPr>
+          <w:rStyle w:val="NormalTok"/>
+        </w:rPr>
+        <w:t xml:space="preserve">close_ts </w:t>
+      </w:r>
+      <w:r>
+        <w:rPr>
+          <w:rStyle w:val="OtherTok"/>
+        </w:rPr>
+        <w:t xml:space="preserve">&lt;-</w:t>
+      </w:r>
+      <w:r>
+        <w:rPr>
+          <w:rStyle w:val="NormalTok"/>
+        </w:rPr>
+        <w:t xml:space="preserve"> </w:t>
+      </w:r>
+      <w:r>
+        <w:rPr>
+          <w:rStyle w:val="FunctionTok"/>
+        </w:rPr>
+        <w:t xml:space="preserve">ts_data</w:t>
+      </w:r>
+      <w:r>
+        <w:rPr>
+          <w:rStyle w:val="NormalTok"/>
+        </w:rPr>
+        <w:t xml:space="preserve">(ticker</w:t>
+      </w:r>
+      <w:r>
+        <w:rPr>
+          <w:rStyle w:val="SpecialCharTok"/>
+        </w:rPr>
+        <w:t xml:space="preserve">$</w:t>
+      </w:r>
+      <w:r>
+        <w:rPr>
+          <w:rStyle w:val="NormalTok"/>
+        </w:rPr>
+        <w:t xml:space="preserve">close, </w:t>
+      </w:r>
+      <w:r>
+        <w:rPr>
+          <w:rStyle w:val="DecValTok"/>
+        </w:rPr>
+        <w:t xml:space="preserve">1</w:t>
+      </w:r>
+      <w:r>
+        <w:rPr>
+          <w:rStyle w:val="NormalTok"/>
+        </w:rPr>
+        <w:t xml:space="preserve">)</w:t>
+      </w:r>
+      <w:r>
+        <w:br/>
+      </w:r>
+      <w:r>
+        <w:rPr>
+          <w:rStyle w:val="NormalTok"/>
+        </w:rPr>
+        <w:t xml:space="preserve">close_samp </w:t>
+      </w:r>
+      <w:r>
+        <w:rPr>
+          <w:rStyle w:val="OtherTok"/>
+        </w:rPr>
+        <w:t xml:space="preserve">&lt;-</w:t>
+      </w:r>
+      <w:r>
+        <w:rPr>
+          <w:rStyle w:val="NormalTok"/>
+        </w:rPr>
+        <w:t xml:space="preserve"> </w:t>
+      </w:r>
+      <w:r>
+        <w:rPr>
+          <w:rStyle w:val="FunctionTok"/>
+        </w:rPr>
+        <w:t xml:space="preserve">ts_sample</w:t>
+      </w:r>
+      <w:r>
+        <w:rPr>
+          <w:rStyle w:val="NormalTok"/>
+        </w:rPr>
+        <w:t xml:space="preserve">(close_ts, </w:t>
+      </w:r>
+      <w:r>
+        <w:rPr>
+          <w:rStyle w:val="AttributeTok"/>
+        </w:rPr>
+        <w:t xml:space="preserve">test_size =</w:t>
+      </w:r>
+      <w:r>
+        <w:rPr>
+          <w:rStyle w:val="NormalTok"/>
+        </w:rPr>
+        <w:t xml:space="preserve"> </w:t>
+      </w:r>
+      <w:r>
+        <w:rPr>
+          <w:rStyle w:val="DecValTok"/>
+        </w:rPr>
+        <w:t xml:space="preserve">5</w:t>
+      </w:r>
+      <w:r>
+        <w:rPr>
+          <w:rStyle w:val="NormalTok"/>
+        </w:rPr>
+        <w:t xml:space="preserve">)</w:t>
+      </w:r>
+      <w:r>
+        <w:br/>
+      </w:r>
+      <w:r>
+        <w:br/>
+      </w:r>
+      <w:r>
+        <w:rPr>
+          <w:rStyle w:val="NormalTok"/>
+        </w:rPr>
+        <w:t xml:space="preserve">arima_baseline </w:t>
+      </w:r>
+      <w:r>
+        <w:rPr>
+          <w:rStyle w:val="OtherTok"/>
+        </w:rPr>
+        <w:t xml:space="preserve">&lt;-</w:t>
+      </w:r>
+      <w:r>
+        <w:rPr>
+          <w:rStyle w:val="NormalTok"/>
+        </w:rPr>
+        <w:t xml:space="preserve"> </w:t>
+      </w:r>
+      <w:r>
+        <w:rPr>
+          <w:rStyle w:val="FunctionTok"/>
+        </w:rPr>
+        <w:t xml:space="preserve">ts_arima</w:t>
+      </w:r>
+      <w:r>
+        <w:rPr>
+          <w:rStyle w:val="NormalTok"/>
+        </w:rPr>
+        <w:t xml:space="preserve">()</w:t>
+      </w:r>
+      <w:r>
+        <w:br/>
+      </w:r>
+      <w:r>
+        <w:rPr>
+          <w:rStyle w:val="NormalTok"/>
+        </w:rPr>
+        <w:t xml:space="preserve">arima_baseline </w:t>
+      </w:r>
+      <w:r>
+        <w:rPr>
+          <w:rStyle w:val="OtherTok"/>
+        </w:rPr>
+        <w:t xml:space="preserve">&lt;-</w:t>
+      </w:r>
+      <w:r>
+        <w:rPr>
+          <w:rStyle w:val="NormalTok"/>
+        </w:rPr>
+        <w:t xml:space="preserve"> </w:t>
+      </w:r>
+      <w:r>
+        <w:rPr>
+          <w:rStyle w:val="FunctionTok"/>
+        </w:rPr>
+        <w:t xml:space="preserve">fit</w:t>
+      </w:r>
+      <w:r>
+        <w:rPr>
+          <w:rStyle w:val="NormalTok"/>
+        </w:rPr>
+        <w:t xml:space="preserve">(arima_baseline, </w:t>
+      </w:r>
+      <w:r>
+        <w:rPr>
+          <w:rStyle w:val="AttributeTok"/>
+        </w:rPr>
+        <w:t xml:space="preserve">x =</w:t>
+      </w:r>
+      <w:r>
+        <w:rPr>
+          <w:rStyle w:val="NormalTok"/>
+        </w:rPr>
+        <w:t xml:space="preserve"> close_samp</w:t>
+      </w:r>
+      <w:r>
+        <w:rPr>
+          <w:rStyle w:val="SpecialCharTok"/>
+        </w:rPr>
+        <w:t xml:space="preserve">$</w:t>
+      </w:r>
+      <w:r>
+        <w:rPr>
+          <w:rStyle w:val="NormalTok"/>
+        </w:rPr>
+        <w:t xml:space="preserve">train)</w:t>
+      </w:r>
+      <w:r>
+        <w:br/>
+      </w:r>
+      <w:r>
+        <w:br/>
+      </w:r>
+      <w:r>
+        <w:rPr>
+          <w:rStyle w:val="NormalTok"/>
+        </w:rPr>
+        <w:t xml:space="preserve">pred_arima </w:t>
+      </w:r>
+      <w:r>
+        <w:rPr>
+          <w:rStyle w:val="OtherTok"/>
+        </w:rPr>
+        <w:t xml:space="preserve">&lt;-</w:t>
+      </w:r>
+      <w:r>
+        <w:rPr>
+          <w:rStyle w:val="NormalTok"/>
+        </w:rPr>
+        <w:t xml:space="preserve"> </w:t>
+      </w:r>
+      <w:r>
+        <w:rPr>
+          <w:rStyle w:val="FunctionTok"/>
+        </w:rPr>
+        <w:t xml:space="preserve">predict</w:t>
+      </w:r>
+      <w:r>
+        <w:rPr>
+          <w:rStyle w:val="NormalTok"/>
+        </w:rPr>
+        <w:t xml:space="preserve">(arima_baseline, </w:t>
+      </w:r>
+      <w:r>
+        <w:rPr>
+          <w:rStyle w:val="AttributeTok"/>
+        </w:rPr>
+        <w:t xml:space="preserve">x =</w:t>
+      </w:r>
+      <w:r>
+        <w:rPr>
+          <w:rStyle w:val="NormalTok"/>
+        </w:rPr>
+        <w:t xml:space="preserve"> close_samp</w:t>
+      </w:r>
+      <w:r>
+        <w:rPr>
+          <w:rStyle w:val="SpecialCharTok"/>
+        </w:rPr>
+        <w:t xml:space="preserve">$</w:t>
+      </w:r>
+      <w:r>
+        <w:rPr>
+          <w:rStyle w:val="NormalTok"/>
+        </w:rPr>
+        <w:t xml:space="preserve">test[</w:t>
+      </w:r>
+      <w:r>
+        <w:rPr>
+          <w:rStyle w:val="DecValTok"/>
+        </w:rPr>
+        <w:t xml:space="preserve">1</w:t>
+      </w:r>
+      <w:r>
+        <w:rPr>
+          <w:rStyle w:val="NormalTok"/>
+        </w:rPr>
+        <w:t xml:space="preserve">,], </w:t>
+      </w:r>
+      <w:r>
+        <w:rPr>
+          <w:rStyle w:val="AttributeTok"/>
+        </w:rPr>
+        <w:t xml:space="preserve">steps_ahead =</w:t>
+      </w:r>
+      <w:r>
+        <w:rPr>
+          <w:rStyle w:val="NormalTok"/>
+        </w:rPr>
+        <w:t xml:space="preserve"> </w:t>
+      </w:r>
+      <w:r>
+        <w:rPr>
+          <w:rStyle w:val="DecValTok"/>
+        </w:rPr>
+        <w:t xml:space="preserve">5</w:t>
+      </w:r>
+      <w:r>
+        <w:rPr>
+          <w:rStyle w:val="NormalTok"/>
+        </w:rPr>
+        <w:t xml:space="preserve">)</w:t>
+      </w:r>
+      <w:r>
+        <w:br/>
+      </w:r>
+      <w:r>
+        <w:rPr>
+          <w:rStyle w:val="NormalTok"/>
+        </w:rPr>
+        <w:t xml:space="preserve">pred_arima </w:t>
+      </w:r>
+      <w:r>
+        <w:rPr>
+          <w:rStyle w:val="OtherTok"/>
+        </w:rPr>
+        <w:t xml:space="preserve">&lt;-</w:t>
+      </w:r>
+      <w:r>
+        <w:rPr>
+          <w:rStyle w:val="NormalTok"/>
+        </w:rPr>
+        <w:t xml:space="preserve"> </w:t>
+      </w:r>
+      <w:r>
+        <w:rPr>
+          <w:rStyle w:val="FunctionTok"/>
+        </w:rPr>
+        <w:t xml:space="preserve">as.vector</w:t>
+      </w:r>
+      <w:r>
+        <w:rPr>
+          <w:rStyle w:val="NormalTok"/>
+        </w:rPr>
+        <w:t xml:space="preserve">(pred_arima)</w:t>
+      </w:r>
+      <w:r>
+        <w:br/>
+      </w:r>
+      <w:r>
+        <w:rPr>
+          <w:rStyle w:val="NormalTok"/>
+        </w:rPr>
+        <w:t xml:space="preserve">ev_arima </w:t>
+      </w:r>
+      <w:r>
+        <w:rPr>
+          <w:rStyle w:val="OtherTok"/>
+        </w:rPr>
+        <w:t xml:space="preserve">&lt;-</w:t>
+      </w:r>
+      <w:r>
+        <w:rPr>
+          <w:rStyle w:val="NormalTok"/>
+        </w:rPr>
+        <w:t xml:space="preserve"> </w:t>
+      </w:r>
+      <w:r>
+        <w:rPr>
+          <w:rStyle w:val="FunctionTok"/>
+        </w:rPr>
+        <w:t xml:space="preserve">evaluate</w:t>
+      </w:r>
+      <w:r>
+        <w:rPr>
+          <w:rStyle w:val="NormalTok"/>
+        </w:rPr>
+        <w:t xml:space="preserve">(arima_baseline, </w:t>
+      </w:r>
+      <w:r>
+        <w:rPr>
+          <w:rStyle w:val="FunctionTok"/>
+        </w:rPr>
+        <w:t xml:space="preserve">as.vector</w:t>
+      </w:r>
+      <w:r>
+        <w:rPr>
+          <w:rStyle w:val="NormalTok"/>
+        </w:rPr>
+        <w:t xml:space="preserve">(close_samp</w:t>
+      </w:r>
+      <w:r>
+        <w:rPr>
+          <w:rStyle w:val="SpecialCharTok"/>
+        </w:rPr>
+        <w:t xml:space="preserve">$</w:t>
+      </w:r>
+      <w:r>
+        <w:rPr>
+          <w:rStyle w:val="NormalTok"/>
+        </w:rPr>
+        <w:t xml:space="preserve">test), pred_arima)</w:t>
+      </w:r>
+      <w:r>
+        <w:br/>
+      </w:r>
+      <w:r>
+        <w:rPr>
+          <w:rStyle w:val="NormalTok"/>
+        </w:rPr>
+        <w:t xml:space="preserve">ev_arima</w:t>
+      </w:r>
+      <w:r>
+        <w:rPr>
+          <w:rStyle w:val="SpecialCharTok"/>
+        </w:rPr>
+        <w:t xml:space="preserve">$</w:t>
+      </w:r>
+      <w:r>
+        <w:rPr>
+          <w:rStyle w:val="NormalTok"/>
+        </w:rPr>
+        <w:t xml:space="preserve">metrics</w:t>
+      </w:r>
+    </w:p>
+    <w:p>
+      <w:pPr>
+        <w:pStyle w:val="SourceCode"/>
+      </w:pPr>
+      <w:r>
+        <w:rPr>
           <w:rStyle w:val="VerbatimChar"/>
         </w:rPr>
         <w:t xml:space="preserve">##        mse      smape        R2</w:t>
@@ -1481,7 +1876,7 @@
         <w:rPr>
           <w:rStyle w:val="VerbatimChar"/>
         </w:rPr>
-        <w:t xml:space="preserve">## 1 4.904158 0.02269408 -2.053065</w:t>
+        <w:t xml:space="preserve">## 1 6.769314 0.02329485 -2.204775</w:t>
       </w:r>
     </w:p>
     <w:p>
@@ -2995,7 +3390,7 @@
         <w:rPr>
           <w:rStyle w:val="VerbatimChar"/>
         </w:rPr>
-        <w:t xml:space="preserve">## [1] 88.5635</w:t>
+        <w:t xml:space="preserve">## [1] 86.1927</w:t>
       </w:r>
     </w:p>
     <w:p>
@@ -3082,7 +3477,7 @@
         <w:rPr>
           <w:rStyle w:val="VerbatimChar"/>
         </w:rPr>
-        <w:t xml:space="preserve">## [1] 88.5635 87.4750 87.6003 87.4603 87.5465</w:t>
+        <w:t xml:space="preserve">## [1] 86.1927 86.1368 85.7986 85.7490 85.7441</w:t>
       </w:r>
     </w:p>
     <w:p>
@@ -3202,7 +3597,7 @@
         <w:rPr>
           <w:rStyle w:val="VerbatimChar"/>
         </w:rPr>
-        <w:t xml:space="preserve">## [1] 88.5635 87.4750 87.6003 87.4603 87.5465</w:t>
+        <w:t xml:space="preserve">## [1] 86.1927 86.1368 85.7986 85.7490 85.7441</w:t>
       </w:r>
       <w:r>
         <w:br/>
@@ -3238,7 +3633,7 @@
         <w:rPr>
           <w:rStyle w:val="VerbatimChar"/>
         </w:rPr>
-        <w:t xml:space="preserve">## [1] 85.80139 88.61880 89.57019 87.88007 88.15521</w:t>
+        <w:t xml:space="preserve">## [1] 85.78517 84.00956 85.78546 86.87644 85.34103</w:t>
       </w:r>
       <w:r>
         <w:br/>
@@ -3265,7 +3660,7 @@
         <w:rPr>
           <w:rStyle w:val="VerbatimChar"/>
         </w:rPr>
-        <w:t xml:space="preserve">## [1] 90.64456 90.82650 89.66789 89.05472 89.18879</w:t>
+        <w:t xml:space="preserve">## [1] 85.99456 87.11913 87.63444 86.98998 86.67025</w:t>
       </w:r>
       <w:r>
         <w:br/>
@@ -3292,7 +3687,7 @@
         <w:rPr>
           <w:rStyle w:val="VerbatimChar"/>
         </w:rPr>
-        <w:t xml:space="preserve">## [1] 86.76855 86.95671 86.91732 87.05260 86.91490</w:t>
+        <w:t xml:space="preserve">## [1] 82.20966 82.47191 82.21620 82.24374 82.37079</w:t>
       </w:r>
       <w:r>
         <w:br/>
@@ -3319,7 +3714,7 @@
         <w:rPr>
           <w:rStyle w:val="VerbatimChar"/>
         </w:rPr>
-        <w:t xml:space="preserve">## [1] 34433500 35625440 34347888 32881186 34999543</w:t>
+        <w:t xml:space="preserve">## [1] 33076060 33506772 34513366 33013400 31279800</w:t>
       </w:r>
       <w:r>
         <w:br/>
@@ -3722,7 +4117,7 @@
               <a:graphicData uri="http://schemas.openxmlformats.org/drawingml/2006/picture">
                 <pic:pic>
                   <pic:nvPicPr>
-                    <pic:cNvPr descr="C:\Git\cefet-rj-dal\tspredit\examples\multivariate\doc\10-stock-close-regression_files/dd727832b88b34188e4d68996a7c0cb4cfdbc69a.png" id="11" name="Picture"/>
+                    <pic:cNvPr descr="C:\Git\cefet-rj-dal\tspredit\examples\multivariate\doc\10-stock-close-regression_files/656cda336f375b7f6df511542a618608a635ecf1.png" id="11" name="Picture"/>
                     <pic:cNvPicPr>
                       <a:picLocks noChangeArrowheads="1" noChangeAspect="1"/>
                     </pic:cNvPicPr>
@@ -3800,7 +4195,7 @@
               <a:graphicData uri="http://schemas.openxmlformats.org/drawingml/2006/picture">
                 <pic:pic>
                   <pic:nvPicPr>
-                    <pic:cNvPr descr="C:\Git\cefet-rj-dal\tspredit\examples\multivariate\doc\10-stock-close-regression_files/569d2500a1611d3fccba98864d1720891809db98.png" id="14" name="Picture"/>
+                    <pic:cNvPr descr="C:\Git\cefet-rj-dal\tspredit\examples\multivariate\doc\10-stock-close-regression_files/c84d6a449ec9c015cbbded84baf7cf2bf8914a2a.png" id="14" name="Picture"/>
                     <pic:cNvPicPr>
                       <a:picLocks noChangeArrowheads="1" noChangeAspect="1"/>
                     </pic:cNvPicPr>
@@ -3878,7 +4273,7 @@
               <a:graphicData uri="http://schemas.openxmlformats.org/drawingml/2006/picture">
                 <pic:pic>
                   <pic:nvPicPr>
-                    <pic:cNvPr descr="C:\Git\cefet-rj-dal\tspredit\examples\multivariate\doc\10-stock-close-regression_files/ff5886af68c6a395304a1411041530f6d043bf0c.png" id="17" name="Picture"/>
+                    <pic:cNvPr descr="C:\Git\cefet-rj-dal\tspredit\examples\multivariate\doc\10-stock-close-regression_files/3e0be8840d0256699c0f0a8a2066bd8794052448.png" id="17" name="Picture"/>
                     <pic:cNvPicPr>
                       <a:picLocks noChangeArrowheads="1" noChangeAspect="1"/>
                     </pic:cNvPicPr>
@@ -4058,16 +4453,16 @@
         <w:rPr>
           <w:rStyle w:val="VerbatimChar"/>
         </w:rPr>
-        <w:t xml:space="preserve">##       mse      smape        R2</w:t>
-      </w:r>
-      <w:r>
-        <w:br/>
-      </w:r>
-      <w:r>
-        <w:rPr>
-          <w:rStyle w:val="VerbatimChar"/>
-        </w:rPr>
-        <w:t xml:space="preserve">## 1 1.19053 0.01033564 0.2588403</w:t>
+        <w:t xml:space="preserve">##        mse      smape        R2</w:t>
+      </w:r>
+      <w:r>
+        <w:br/>
+      </w:r>
+      <w:r>
+        <w:rPr>
+          <w:rStyle w:val="VerbatimChar"/>
+        </w:rPr>
+        <w:t xml:space="preserve">## 1 4.312106 0.01930004 -1.041467</w:t>
       </w:r>
     </w:p>
     <w:p>
@@ -4184,25 +4579,25 @@
         <w:rPr>
           <w:rStyle w:val="VerbatimChar"/>
         </w:rPr>
-        <w:t xml:space="preserve">##                  mse      smape         R2</w:t>
-      </w:r>
-      <w:r>
-        <w:br/>
-      </w:r>
-      <w:r>
-        <w:rPr>
-          <w:rStyle w:val="VerbatimChar"/>
-        </w:rPr>
-        <w:t xml:space="preserve">## ARIMA_close 4.904158 0.02269408 -2.0530650</w:t>
-      </w:r>
-      <w:r>
-        <w:br/>
-      </w:r>
-      <w:r>
-        <w:rPr>
-          <w:rStyle w:val="VerbatimChar"/>
-        </w:rPr>
-        <w:t xml:space="preserve">## MV_mixed    1.190530 0.01033564  0.2588403</w:t>
+        <w:t xml:space="preserve">##                  mse      smape        R2</w:t>
+      </w:r>
+      <w:r>
+        <w:br/>
+      </w:r>
+      <w:r>
+        <w:rPr>
+          <w:rStyle w:val="VerbatimChar"/>
+        </w:rPr>
+        <w:t xml:space="preserve">## ARIMA_close 6.769314 0.02329485 -2.204775</w:t>
+      </w:r>
+      <w:r>
+        <w:br/>
+      </w:r>
+      <w:r>
+        <w:rPr>
+          <w:rStyle w:val="VerbatimChar"/>
+        </w:rPr>
+        <w:t xml:space="preserve">## MV_mixed    4.312106 0.01930004 -1.041467</w:t>
       </w:r>
     </w:p>
     <w:p>

</xml_diff>